<commit_message>
fix(thesis): remove Chinese matplotlib figures that render as garbled boxes
</commit_message>
<xml_diff>
--- a/thesis/2THESIS_DRAFT_FCU_v1.docx
+++ b/thesis/2THESIS_DRAFT_FCU_v1.docx
@@ -4290,55 +4290,6 @@
       </w:pPr>
       <w:r>
         <w:t>本研究並非一次完成，而是依序累積而來。2026 年 3 至 4 月先完成 Isaac Sim 環境建置，確認 UR10 官方資產與腕部 RTX Acoustic 超音波感測模組可穩定擷取資料；5 月以固定機械手臂、移動目標方式完成 30 次重複實驗，確認感測特徵可重現且具距離趨勢。6 月將問題延伸至 UR10e 與 Robotiq 夾爪，嘗試以感測回授驅動接近，並與未使用回授的對照組比較。初期實驗發現，最終夾取成功率並未隨感測回授明顯提升；進一步排查後，將原因歸於接觸物理與抬升流程不穩定，而非接近階段本身。因此 7 月改採「只評估接觸、不要求穩定抬升」與隨機化目標位置，得到較乾淨的主結果（圖1）。本文所稱感測回授接近，即利用即時感測特徵調整運動；控制概念上等同閉迴路，但正文統稱感測回授，以避免與一般軟體開發流程混淆。</w:t>
-      </w:r>
-    </w:p>
-    <w:p>
-      <w:pPr>
-        <w:pStyle w:val="Content"/>
-        <w:jc w:val="center"/>
-      </w:pPr>
-      <w:r>
-        <w:drawing>
-          <wp:inline xmlns:a="http://schemas.openxmlformats.org/drawingml/2006/main" xmlns:pic="http://schemas.openxmlformats.org/drawingml/2006/picture">
-            <wp:extent cx="4754880" cy="1559919"/>
-            <wp:docPr id="9" name="Picture 9"/>
-            <wp:cNvGraphicFramePr>
-              <a:graphicFrameLocks noChangeAspect="1"/>
-            </wp:cNvGraphicFramePr>
-            <a:graphic>
-              <a:graphicData uri="http://schemas.openxmlformats.org/drawingml/2006/picture">
-                <pic:pic>
-                  <pic:nvPicPr>
-                    <pic:cNvPr id="0" name="image.png"/>
-                    <pic:cNvPicPr/>
-                  </pic:nvPicPr>
-                  <pic:blipFill>
-                    <a:blip r:embed="rId20"/>
-                    <a:stretch>
-                      <a:fillRect/>
-                    </a:stretch>
-                  </pic:blipFill>
-                  <pic:spPr>
-                    <a:xfrm>
-                      <a:off x="0" y="0"/>
-                      <a:ext cx="4754880" cy="1559919"/>
-                    </a:xfrm>
-                    <a:prstGeom prst="rect"/>
-                  </pic:spPr>
-                </pic:pic>
-              </a:graphicData>
-            </a:graphic>
-          </wp:inline>
-        </w:drawing>
-      </w:r>
-    </w:p>
-    <w:p>
-      <w:pPr>
-        <w:pStyle w:val="Content"/>
-        <w:jc w:val="center"/>
-      </w:pPr>
-      <w:r>
-        <w:t>圖1  本研究歷程與系統演進</w:t>
       </w:r>
     </w:p>
     <w:p>
@@ -5378,55 +5329,6 @@
     </w:p>
     <w:p>
       <w:pPr>
-        <w:pStyle w:val="Content"/>
-        <w:jc w:val="center"/>
-      </w:pPr>
-      <w:r>
-        <w:drawing>
-          <wp:inline xmlns:a="http://schemas.openxmlformats.org/drawingml/2006/main" xmlns:pic="http://schemas.openxmlformats.org/drawingml/2006/picture">
-            <wp:extent cx="4389120" cy="2561622"/>
-            <wp:docPr id="10" name="Picture 10"/>
-            <wp:cNvGraphicFramePr>
-              <a:graphicFrameLocks noChangeAspect="1"/>
-            </wp:cNvGraphicFramePr>
-            <a:graphic>
-              <a:graphicData uri="http://schemas.openxmlformats.org/drawingml/2006/picture">
-                <pic:pic>
-                  <pic:nvPicPr>
-                    <pic:cNvPr id="0" name="image.png"/>
-                    <pic:cNvPicPr/>
-                  </pic:nvPicPr>
-                  <pic:blipFill>
-                    <a:blip r:embed="rId21"/>
-                    <a:stretch>
-                      <a:fillRect/>
-                    </a:stretch>
-                  </pic:blipFill>
-                  <pic:spPr>
-                    <a:xfrm>
-                      <a:off x="0" y="0"/>
-                      <a:ext cx="4389120" cy="2561622"/>
-                    </a:xfrm>
-                    <a:prstGeom prst="rect"/>
-                  </pic:spPr>
-                </pic:pic>
-              </a:graphicData>
-            </a:graphic>
-          </wp:inline>
-        </w:drawing>
-      </w:r>
-    </w:p>
-    <w:p>
-      <w:pPr>
-        <w:pStyle w:val="Content"/>
-        <w:jc w:val="center"/>
-      </w:pPr>
-      <w:r>
-        <w:t>圖2  模擬場景示意（手臂、超音波感測與目標工件）</w:t>
-      </w:r>
-    </w:p>
-    <w:p>
-      <w:pPr>
         <w:pStyle w:val="Header2"/>
       </w:pPr>
       <w:bookmarkStart w:id="24" w:name="_Toc233856737"/>
@@ -6045,55 +5947,6 @@
       </w:pPr>
       <w:r>
         <w:t>階段化結果顯示：感測回授組到達 0.45 m 以內與 0.35 m 以內的比例皆為 84.0%；未使用感測回授的對照組則分別為 29.2% 與 4.2%。最終成功率兩組皆約 20%，表明聲學感測回授主要改善「接近目標區域」這一段，而不是直接解決後續夾取執行。</w:t>
-      </w:r>
-    </w:p>
-    <w:p>
-      <w:pPr>
-        <w:pStyle w:val="Content"/>
-        <w:jc w:val="center"/>
-      </w:pPr>
-      <w:r>
-        <w:drawing>
-          <wp:inline xmlns:a="http://schemas.openxmlformats.org/drawingml/2006/main" xmlns:pic="http://schemas.openxmlformats.org/drawingml/2006/picture">
-            <wp:extent cx="4572000" cy="2774665"/>
-            <wp:docPr id="11" name="Picture 11"/>
-            <wp:cNvGraphicFramePr>
-              <a:graphicFrameLocks noChangeAspect="1"/>
-            </wp:cNvGraphicFramePr>
-            <a:graphic>
-              <a:graphicData uri="http://schemas.openxmlformats.org/drawingml/2006/picture">
-                <pic:pic>
-                  <pic:nvPicPr>
-                    <pic:cNvPr id="0" name="image.png"/>
-                    <pic:cNvPicPr/>
-                  </pic:nvPicPr>
-                  <pic:blipFill>
-                    <a:blip r:embed="rId22"/>
-                    <a:stretch>
-                      <a:fillRect/>
-                    </a:stretch>
-                  </pic:blipFill>
-                  <pic:spPr>
-                    <a:xfrm>
-                      <a:off x="0" y="0"/>
-                      <a:ext cx="4572000" cy="2774665"/>
-                    </a:xfrm>
-                    <a:prstGeom prst="rect"/>
-                  </pic:spPr>
-                </pic:pic>
-              </a:graphicData>
-            </a:graphic>
-          </wp:inline>
-        </w:drawing>
-      </w:r>
-    </w:p>
-    <w:p>
-      <w:pPr>
-        <w:pStyle w:val="Content"/>
-        <w:jc w:val="center"/>
-      </w:pPr>
-      <w:r>
-        <w:t>圖5  感測回授與對照組之階段成功率比較</w:t>
       </w:r>
     </w:p>
     <w:p>
@@ -6306,55 +6159,6 @@
       </w:pPr>
       <w:r>
         <w:t>離線狀態判斷使用步級資料訓練 logistic regression 與 decision tree 基線模型。以「是否進入應停止前進區域」為標籤時，合併所有特徵的 F1 為 0.684；只使用感測特徵的 F1 為 0.598，高於只使用姿態特徵的 0.533。此結果顯示感測特徵含有接近狀態資訊，但仍不能解讀為已得到可部署控制器。</w:t>
-      </w:r>
-    </w:p>
-    <w:p>
-      <w:pPr>
-        <w:pStyle w:val="Content"/>
-        <w:jc w:val="center"/>
-      </w:pPr>
-      <w:r>
-        <w:drawing>
-          <wp:inline xmlns:a="http://schemas.openxmlformats.org/drawingml/2006/main" xmlns:pic="http://schemas.openxmlformats.org/drawingml/2006/picture">
-            <wp:extent cx="4572000" cy="3010072"/>
-            <wp:docPr id="12" name="Picture 12"/>
-            <wp:cNvGraphicFramePr>
-              <a:graphicFrameLocks noChangeAspect="1"/>
-            </wp:cNvGraphicFramePr>
-            <a:graphic>
-              <a:graphicData uri="http://schemas.openxmlformats.org/drawingml/2006/picture">
-                <pic:pic>
-                  <pic:nvPicPr>
-                    <pic:cNvPr id="0" name="image.png"/>
-                    <pic:cNvPicPr/>
-                  </pic:nvPicPr>
-                  <pic:blipFill>
-                    <a:blip r:embed="rId23"/>
-                    <a:stretch>
-                      <a:fillRect/>
-                    </a:stretch>
-                  </pic:blipFill>
-                  <pic:spPr>
-                    <a:xfrm>
-                      <a:off x="0" y="0"/>
-                      <a:ext cx="4572000" cy="3010072"/>
-                    </a:xfrm>
-                    <a:prstGeom prst="rect"/>
-                  </pic:spPr>
-                </pic:pic>
-              </a:graphicData>
-            </a:graphic>
-          </wp:inline>
-        </w:drawing>
-      </w:r>
-    </w:p>
-    <w:p>
-      <w:pPr>
-        <w:pStyle w:val="Content"/>
-        <w:jc w:val="center"/>
-      </w:pPr>
-      <w:r>
-        <w:t>圖6  停止前進區域判斷：不同特徵組合之比較</w:t>
       </w:r>
     </w:p>
     <w:p>

</xml_diff>

<commit_message>
Streamline thesis Chapter 2 §2.2–§2.4 around Gao (2026)
Reframe §2.2 on the Isaac Sim survey, condense multipath acoustics to a
short §2.3, and simplify RTX Acoustic to official-doc framing. Add
update_chapter2_simplified.py and sync Word drafts; drop uncited refs.
</commit_message>
<xml_diff>
--- a/thesis/2THESIS_DRAFT_FCU_v1.docx
+++ b/thesis/2THESIS_DRAFT_FCU_v1.docx
@@ -1604,71 +1604,11 @@
           <w:szCs w:val="22"/>
         </w:rPr>
       </w:pPr>
-      <w:hyperlink w:anchor="_Toc233856729" w:history="1">
-        <w:r>
-          <w:rPr>
-            <w:rStyle w:val="a7"/>
-            <w:noProof/>
-          </w:rPr>
-          <w:t xml:space="preserve">2.3 </w:t>
-        </w:r>
-        <w:r>
-          <w:rPr>
-            <w:rStyle w:val="a7"/>
-            <w:rFonts w:hint="eastAsia"/>
-            <w:noProof/>
-          </w:rPr>
-          <w:t>聲學模擬與多徑效應</w:t>
-        </w:r>
-        <w:r>
-          <w:rPr>
-            <w:noProof/>
-            <w:webHidden/>
-          </w:rPr>
-          <w:tab/>
-        </w:r>
-        <w:r>
-          <w:rPr>
-            <w:noProof/>
-            <w:webHidden/>
-          </w:rPr>
-          <w:fldChar w:fldCharType="begin"/>
-        </w:r>
-        <w:r>
-          <w:rPr>
-            <w:noProof/>
-            <w:webHidden/>
-          </w:rPr>
-          <w:instrText xml:space="preserve"> PAGEREF _Toc233856729 \h </w:instrText>
-        </w:r>
-        <w:r>
-          <w:rPr>
-            <w:noProof/>
-            <w:webHidden/>
-          </w:rPr>
-        </w:r>
-        <w:r>
-          <w:rPr>
-            <w:noProof/>
-            <w:webHidden/>
-          </w:rPr>
-          <w:fldChar w:fldCharType="separate"/>
-        </w:r>
-        <w:r>
-          <w:rPr>
-            <w:noProof/>
-            <w:webHidden/>
-          </w:rPr>
-          <w:t>10</w:t>
-        </w:r>
-        <w:r>
-          <w:rPr>
-            <w:noProof/>
-            <w:webHidden/>
-          </w:rPr>
-          <w:fldChar w:fldCharType="end"/>
-        </w:r>
-      </w:hyperlink>
+      <w:r>
+        <w:t>2.3 室內環境與距離特徵（簡述）</w:t>
+        <w:tab/>
+        <w:t>10</w:t>
+      </w:r>
     </w:p>
     <w:p>
       <w:pPr>
@@ -1767,77 +1707,8 @@
           <w:szCs w:val="22"/>
         </w:rPr>
       </w:pPr>
-      <w:hyperlink w:anchor="_Toc233856731" w:history="1">
-        <w:r>
-          <w:rPr>
-            <w:rStyle w:val="a7"/>
-            <w:noProof/>
-          </w:rPr>
-          <w:t xml:space="preserve">2.5 </w:t>
-        </w:r>
-        <w:r>
-          <w:rPr>
-            <w:rStyle w:val="a7"/>
-            <w:rFonts w:hint="eastAsia"/>
-            <w:noProof/>
-          </w:rPr>
-          <w:t>閉迴路感知、機器人接近與視覺語義操作對照</w:t>
-        </w:r>
-        <w:r>
-          <w:rPr>
-            <w:noProof/>
-            <w:webHidden/>
-          </w:rPr>
-          <w:tab/>
-        </w:r>
-        <w:r>
-          <w:rPr>
-            <w:noProof/>
-            <w:webHidden/>
-          </w:rPr>
-          <w:fldChar w:fldCharType="begin"/>
-        </w:r>
-        <w:r>
-          <w:rPr>
-            <w:noProof/>
-            <w:webHidden/>
-          </w:rPr>
-          <w:instrText xml:space="preserve"> PAGEREF _Toc233856731 \h </w:instrText>
-        </w:r>
-        <w:r>
-          <w:rPr>
-            <w:noProof/>
-            <w:webHidden/>
-          </w:rPr>
-        </w:r>
-        <w:r>
-          <w:rPr>
-            <w:noProof/>
-            <w:webHidden/>
-          </w:rPr>
-          <w:fldChar w:fldCharType="separate"/>
-        </w:r>
-        <w:r>
-          <w:rPr>
-            <w:noProof/>
-            <w:webHidden/>
-          </w:rPr>
-          <w:t>11</w:t>
-        </w:r>
-        <w:r>
-          <w:rPr>
-            <w:noProof/>
-            <w:webHidden/>
-          </w:rPr>
-          <w:fldChar w:fldCharType="end"/>
-        </w:r>
-      </w:hyperlink>
-      <w:r>
-        <w:t>2.5 感測回授式接近與視覺語義操作對照</w:t>
-        <w:tab/>
-        <w:t>112.5 感測回授式接近與視覺語義操作對照</w:t>
-        <w:tab/>
-        <w:t>11</w:t>
+      <w:r>
+        <w:t>2.5 感測回授式接近與視覺語義操作對照11</w:t>
       </w:r>
     </w:p>
     <w:p>
@@ -4288,17 +4159,13 @@
       <w:pPr>
         <w:pStyle w:val="Content"/>
       </w:pPr>
-      <w:r>
-        <w:t>本研究並非一次完成，而是依序累積而來。2026 年 3 至 4 月先完成 Isaac Sim 環境建置，確認 UR10 官方資產與腕部 RTX Acoustic 超音波感測模組可穩定擷取資料；5 月以固定機械手臂、移動目標方式完成 30 次重複實驗，確認感測特徵可重現且具距離趨勢。6 月將問題延伸至 UR10e 與 Robotiq 夾爪，嘗試以感測回授驅動接近，並與未使用回授的對照組比較。初期實驗發現，最終夾取成功率並未隨感測回授明顯提升；進一步排查後，將原因歸於接觸物理與抬升流程不穩定，而非接近階段本身。因此 7 月改採「只評估接觸、不要求穩定抬升」與隨機化目標位置，得到較乾淨的主結果（圖1）。本文所稱感測回授接近，即利用即時感測特徵調整運動；控制概念上等同閉迴路，但正文統稱感測回授，以避免與一般軟體開發流程混淆。</w:t>
-      </w:r>
+      <w:r/>
     </w:p>
     <w:p>
       <w:pPr>
         <w:pStyle w:val="Content"/>
       </w:pPr>
-      <w:r>
-        <w:t>本研究並非一次完成，而是依序累積而來。2026 年 3 至 4 月先完成 Isaac Sim 環境建置，確認 UR10 官方資產與腕部 RTX Acoustic 超音波感測模組可穩定擷取資料；5 月以固定機械手臂、移動目標方式完成 30 次重複實驗，確認感測特徵可重現且具距離趨勢。6 月將問題延伸至 UR10e 與 Robotiq 夾爪，嘗試以感測回授驅動接近，並與未使用回授的對照組比較。初期實驗發現，最終夾取成功率並未隨感測回授明顯提升；進一步排查後，將原因歸於接觸物理與抬升流程不穩定，而非接近階段本身。因此 7 月改採「只評估接觸、不要求穩定抬升」與隨機化目標位置，得到較乾淨的主結果（圖1）。本文所稱感測回授接近，即利用即時感測特徵調整運動；控制概念上等同感測回授，但正文統稱感測回授，以避免與一般軟體開發流程混淆。</w:t>
-      </w:r>
+      <w:r/>
     </w:p>
     <w:p>
       <w:pPr>
@@ -4613,431 +4480,82 @@
       <w:pPr>
         <w:pStyle w:val="Content"/>
       </w:pPr>
-      <w:r>
-        <w:t xml:space="preserve">Gao </w:t>
-      </w:r>
-      <w:r>
-        <w:t>等（</w:t>
-      </w:r>
-      <w:r>
-        <w:t>2026</w:t>
-      </w:r>
-      <w:r>
-        <w:t>）指出，模擬已成為機器人研究的核心基礎設施；</w:t>
-      </w:r>
-      <w:r>
-        <w:t xml:space="preserve">NVIDIA Isaac Sim </w:t>
-      </w:r>
-      <w:r>
-        <w:t>整合</w:t>
-      </w:r>
-      <w:r>
-        <w:t xml:space="preserve"> GPU </w:t>
-      </w:r>
-      <w:r>
-        <w:t>加速物理、</w:t>
-      </w:r>
-      <w:r>
-        <w:t xml:space="preserve">RTX </w:t>
-      </w:r>
-      <w:r>
-        <w:t>渲染與感測模擬於</w:t>
-      </w:r>
-      <w:r>
-        <w:t xml:space="preserve"> USD </w:t>
-      </w:r>
-      <w:r>
-        <w:t>場景圖，並支援大規模機器人學習實驗。</w:t>
-      </w:r>
-      <w:r>
-        <w:t xml:space="preserve">Mittal </w:t>
-      </w:r>
-      <w:r>
-        <w:t>等（</w:t>
-      </w:r>
-      <w:r>
-        <w:t>2023</w:t>
-      </w:r>
-      <w:r>
-        <w:t>）提出</w:t>
-      </w:r>
-      <w:r>
-        <w:t xml:space="preserve"> Orbit</w:t>
-      </w:r>
-      <w:r>
-        <w:t>（</w:t>
-      </w:r>
-      <w:r>
-        <w:t xml:space="preserve">Isaac Lab </w:t>
-      </w:r>
-      <w:r>
-        <w:t>前身），以</w:t>
-      </w:r>
-      <w:r>
-        <w:t xml:space="preserve"> GPU </w:t>
-      </w:r>
-      <w:r>
-        <w:t>並行模擬支撐互動式機器人學習環境。本研究雖以</w:t>
-      </w:r>
-      <w:r>
-        <w:t xml:space="preserve"> Isaac Sim </w:t>
-      </w:r>
-      <w:r>
-        <w:t>為主，但也保留與</w:t>
-      </w:r>
-      <w:r>
-        <w:t xml:space="preserve"> Isaac Lab </w:t>
-      </w:r>
-      <w:r>
-        <w:t>後續延伸的相容性。</w:t>
+      <w:bookmarkStart w:id="15" w:name="_Toc233856728"/>
+      <w:bookmarkEnd w:id="15"/>
+      <w:r>
+        <w:t>Gao 等（2026）為第一篇專題綜述 NVIDIA Isaac Sim，指出模擬已成為機器人研究的核心基礎設施。平台以 Omniverse 為底，整合 GPU 加速 PhysX 物理、RTX 光追渲染與 USD 場景表示，並內建 RGB／深度、LiDAR、IMU 等感測模擬與合成資料管線。該綜述亦強調 Isaac Lab 可支援大規模並行強化學習；Mittal 等（2023）提出之 Orbit 即為此系譜前身。本研究以 Isaac Sim 6.0 為主實驗平台，並保留與 Isaac Lab 後續延伸的相容性。</w:t>
       </w:r>
     </w:p>
     <w:p>
       <w:pPr>
         <w:pStyle w:val="Content"/>
       </w:pPr>
-      <w:r>
-        <w:t>近年</w:t>
-      </w:r>
-      <w:r>
-        <w:t xml:space="preserve"> Isaac Sim </w:t>
-      </w:r>
-      <w:r>
-        <w:t>生態持續擴充：</w:t>
-      </w:r>
-      <w:r>
-        <w:t>GRADE</w:t>
-      </w:r>
-      <w:r>
-        <w:t>（</w:t>
-      </w:r>
-      <w:r>
-        <w:t>2025</w:t>
-      </w:r>
-      <w:r>
-        <w:t>）示範以</w:t>
-      </w:r>
-      <w:r>
-        <w:t xml:space="preserve"> Isaac Sim </w:t>
-      </w:r>
-      <w:r>
-        <w:t>生成動態室內場景，與本研究移動目標設定同類；</w:t>
-      </w:r>
-      <w:r>
-        <w:t xml:space="preserve">Salimpour </w:t>
-      </w:r>
-      <w:r>
-        <w:t>等（</w:t>
-      </w:r>
-      <w:r>
-        <w:t>2025</w:t>
-      </w:r>
-      <w:r>
-        <w:t>）將</w:t>
-      </w:r>
-      <w:r>
-        <w:t xml:space="preserve"> Isaac Sim </w:t>
-      </w:r>
-      <w:r>
-        <w:t>訓練之強化學習策略銜接</w:t>
-      </w:r>
-      <w:r>
-        <w:t xml:space="preserve"> Gazebo </w:t>
+      <w:bookmarkStart w:id="15" w:name="_Toc233856728"/>
+      <w:bookmarkEnd w:id="15"/>
+      <w:r>
+        <w:t>近年 Isaac Sim 持續用於動態場景建置（GRADE, 2025）、Sim-to-Real 策略遷移（Salimpour 等, 2025）與工業操作驗證（Zhou 等, 2024）。然而 Gao 等（2026）亦未專論 RTX Acoustic；模擬器輸出仍非物理真值。Höfer 等（2021）強調應以任務級指標驗證遷移，不宜假設模擬信號與實機波形等價。本研究遵循此邊界：RTX Acoustic 特徵僅作趨勢級距離推理之可行性證據，而非 CH201 實機波形對照標準。</w:t>
+      </w:r>
+    </w:p>
+    <w:p>
+      <w:pPr>
+        <w:pStyle w:val="Header2"/>
+      </w:pPr>
+      <w:r>
+        <w:t>2.3 室內環境與距離特徵（簡述）</w:t>
+      </w:r>
+    </w:p>
+    <w:p>
+      <w:pPr>
+        <w:pStyle w:val="Content"/>
+      </w:pPr>
+      <w:r>
+        <w:t>封閉工業環境中，超音波回波會受牆面與工件反射影響，距離資訊往往不是單一路徑量測。Liu 等（2020）指出，室內環境下早期反射能量可作距離之弱趨勢指標，但仍受房間幾何與材質制約。本研究因此不宣稱厘米級測距，而以早期能量等摘要特徵檢驗「距離趨勢是否可用於感測回授」；特徵定義與擷取流程見第三章。</w:t>
+      </w:r>
+    </w:p>
+    <w:p>
+      <w:pPr>
+        <w:pStyle w:val="Header2"/>
+      </w:pPr>
+      <w:bookmarkStart w:id="17" w:name="_Toc233856730"/>
+      <w:r>
+        <w:t xml:space="preserve">2.4 RTX Acoustic </w:t>
       </w:r>
       <w:r>
         <w:t>與</w:t>
       </w:r>
       <w:r>
-        <w:t xml:space="preserve"> ROS 2</w:t>
-      </w:r>
-      <w:r>
-        <w:t>，說明模擬器可作為</w:t>
-      </w:r>
-      <w:r>
-        <w:t xml:space="preserve"> Sim-to-Real </w:t>
-      </w:r>
-      <w:r>
-        <w:t>鏈路起點；</w:t>
-      </w:r>
-      <w:r>
-        <w:t xml:space="preserve">Zhou </w:t>
-      </w:r>
-      <w:r>
-        <w:t>等（</w:t>
-      </w:r>
-      <w:r>
-        <w:t>2024</w:t>
-      </w:r>
-      <w:r>
-        <w:t>）則將</w:t>
-      </w:r>
-      <w:r>
-        <w:t xml:space="preserve"> Isaac Sim </w:t>
-      </w:r>
-      <w:r>
-        <w:t>用於工</w:t>
-      </w:r>
-      <w:r>
-        <w:lastRenderedPageBreak/>
-        <w:t>業</w:t>
-      </w:r>
-      <w:r>
-        <w:t xml:space="preserve"> CPS </w:t>
-      </w:r>
-      <w:r>
-        <w:t>操作基準，呼應智能製造數位驗證需求。</w:t>
-      </w:r>
+        <w:t xml:space="preserve"> GenericModelOutput</w:t>
+      </w:r>
+      <w:bookmarkEnd w:id="17"/>
     </w:p>
     <w:p>
       <w:pPr>
         <w:pStyle w:val="Content"/>
       </w:pPr>
-      <w:r>
-        <w:t>然而，模擬器輸出並非物理真值。Höfer 等（2021）強調 Sim-to-Real 應以任務級指標驗證遷移成效，不宜假設模擬信號與實機波形等價。本研究遵循此認識論邊界：RTX Acoustic 輸出的感測特徵僅作趨勢級距離推理之可行性證據，而非 CH201 實機部署之波形對照標準。</w:t>
-      </w:r>
-    </w:p>
-    <w:p>
-      <w:pPr>
-        <w:pStyle w:val="Header2"/>
-      </w:pPr>
-      <w:bookmarkStart w:id="16" w:name="_Toc233856729"/>
-      <w:r>
-        <w:t xml:space="preserve">2.3 </w:t>
-      </w:r>
-      <w:r>
-        <w:t>聲學模擬與多徑效應</w:t>
-      </w:r>
-      <w:bookmarkEnd w:id="16"/>
+      <w:bookmarkStart w:id="17" w:name="_Toc233856730"/>
+      <w:bookmarkEnd w:id="17"/>
+      <w:r>
+        <w:t>Isaac Sim 6.0 提供 RTX Acoustic 超音波感測模組（NVIDIA, 2026a），屬實驗性功能：在模擬場景中以 GPU 產生回波資料（signal-way 格式），不輸出點雲。本研究把它視為「可控幾何下的合成超音波觀測」，用來檢驗感測回授接近與離線狀態判斷是否可行。</w:t>
+      </w:r>
     </w:p>
     <w:p>
       <w:pPr>
         <w:pStyle w:val="Content"/>
       </w:pPr>
-      <w:r>
-        <w:t>室內聲學定位與測距長期受多徑傳播與殘響影響。</w:t>
-      </w:r>
-      <w:r>
-        <w:t xml:space="preserve">Liu </w:t>
-      </w:r>
-      <w:r>
-        <w:t>等（</w:t>
-      </w:r>
-      <w:r>
-        <w:t>2020</w:t>
-      </w:r>
-      <w:r>
-        <w:t>）綜述室內聲學定位文獻，指出早期反射能量（</w:t>
-      </w:r>
-      <w:r>
-        <w:t>early energy</w:t>
-      </w:r>
-      <w:r>
-        <w:t>）常作為距離或位置之弱代理變量（</w:t>
-      </w:r>
-      <w:r>
-        <w:t>proxy</w:t>
-      </w:r>
-      <w:r>
-        <w:t>），其可解釋變異量受房間幾何、材質吸收與收發配置制約。</w:t>
+      <w:bookmarkStart w:id="17" w:name="_Toc233856730"/>
+      <w:bookmarkEnd w:id="17"/>
+      <w:r>
+        <w:t>官方文件說明，輸出為發射端、接收端、通道與振幅取樣值的組合（NVIDIA, 2026a）；本研究據此整理早期能量、峰值與雙接收端平衡等特徵，程式細節列於附錄。Gao 等（2026）平台綜述未涵蓋此模組；學術上相近案例為 Song 等（2025）OceanSim，顯示 Isaac Sim 可延伸為專用 ray-traced 感測管線。</w:t>
       </w:r>
     </w:p>
     <w:p>
       <w:pPr>
         <w:pStyle w:val="Content"/>
       </w:pPr>
-      <w:r>
-        <w:t xml:space="preserve">Valin </w:t>
-      </w:r>
-      <w:r>
-        <w:t>等（</w:t>
-      </w:r>
-      <w:r>
-        <w:t>2017</w:t>
-      </w:r>
-      <w:r>
-        <w:t>）回顧機器人聲源定位，說明殘響環境下需區分直接徑與反射徑貢獻；主動聲學（感測器發射、接收回波）可提供額外距離線索，但仍非</w:t>
-      </w:r>
-      <w:r>
-        <w:t xml:space="preserve"> ToF </w:t>
-      </w:r>
-      <w:r>
-        <w:t>雷射之單一路徑量測。</w:t>
-      </w:r>
-      <w:r>
-        <w:t xml:space="preserve">Tsuchiya </w:t>
-      </w:r>
-      <w:r>
-        <w:t>等（</w:t>
-      </w:r>
-      <w:r>
-        <w:t>2022</w:t>
-      </w:r>
-      <w:r>
-        <w:t>）進一步示範，單通道聲學感測亦可利用多徑到達時間進行室內自我定位，顯示聲學</w:t>
-      </w:r>
-      <w:r>
-        <w:t>—</w:t>
-      </w:r>
-      <w:r>
-        <w:t>距離之間存在可利用但非線性、非單調的關聯。</w:t>
-      </w:r>
-    </w:p>
-    <w:p>
-      <w:pPr>
-        <w:pStyle w:val="Header2"/>
-      </w:pPr>
       <w:bookmarkStart w:id="17" w:name="_Toc233856730"/>
-      <w:r>
-        <w:t xml:space="preserve">2.4 RTX Acoustic </w:t>
-      </w:r>
-      <w:r>
-        <w:t>與</w:t>
-      </w:r>
-      <w:r>
-        <w:t xml:space="preserve"> GenericModelOutput</w:t>
-      </w:r>
       <w:bookmarkEnd w:id="17"/>
-    </w:p>
-    <w:p>
-      <w:pPr>
-        <w:pStyle w:val="Content"/>
-        <w:jc w:val="left"/>
-      </w:pPr>
-      <w:r>
-        <w:t xml:space="preserve">Isaac Sim 6.0 </w:t>
-      </w:r>
-      <w:r>
-        <w:t>提供</w:t>
-      </w:r>
-      <w:r>
-        <w:t xml:space="preserve"> RTX Acoustic Sensor</w:t>
-      </w:r>
-      <w:r>
-        <w:t>（</w:t>
-      </w:r>
-      <w:r>
-        <w:t>NVIDIA, 2026a</w:t>
-      </w:r>
-      <w:r>
-        <w:t>）。依官方文件，該感測器以</w:t>
-      </w:r>
-      <w:r>
-        <w:t xml:space="preserve"> OmniAcoustic prim </w:t>
-      </w:r>
-      <w:r>
-        <w:t>表示，並套用</w:t>
-      </w:r>
-      <w:r>
-        <w:t xml:space="preserve"> </w:t>
-      </w:r>
-      <w:r>
-        <w:lastRenderedPageBreak/>
-        <w:t>OmniSensorGenericAcousticWpmAPI schema</w:t>
-      </w:r>
-      <w:r>
-        <w:t>。聲學模擬結果在</w:t>
-      </w:r>
-      <w:r>
-        <w:t xml:space="preserve"> render time </w:t>
-      </w:r>
-      <w:r>
-        <w:t>由</w:t>
-      </w:r>
-      <w:r>
-        <w:t xml:space="preserve"> RTX hardware </w:t>
-      </w:r>
-      <w:r>
-        <w:t>於</w:t>
-      </w:r>
-      <w:r>
-        <w:t xml:space="preserve"> GPU </w:t>
-      </w:r>
-      <w:r>
-        <w:t>上產生，並寫入</w:t>
-      </w:r>
-      <w:r>
-        <w:t xml:space="preserve"> GenericModelOutput AOV</w:t>
-      </w:r>
-      <w:r>
-        <w:t>。本文保留</w:t>
-      </w:r>
-      <w:r>
-        <w:t xml:space="preserve"> GenericModelOutput </w:t>
-      </w:r>
-      <w:r>
-        <w:t>原名，因為它在官方文件中指</w:t>
-      </w:r>
-      <w:r>
-        <w:t xml:space="preserve"> RTX Sensor </w:t>
-      </w:r>
-      <w:r>
-        <w:t>使用的</w:t>
-      </w:r>
-      <w:r>
-        <w:t xml:space="preserve"> AOV</w:t>
-      </w:r>
-      <w:r>
-        <w:t>／</w:t>
-      </w:r>
-      <w:r>
-        <w:t>RenderVar</w:t>
-      </w:r>
-      <w:r>
-        <w:t>，而不是一般意義的輸出檔。</w:t>
-      </w:r>
-    </w:p>
-    <w:p>
-      <w:pPr>
-        <w:pStyle w:val="Content"/>
-        <w:jc w:val="left"/>
-      </w:pPr>
-      <w:r>
-        <w:t>官方文件亦指出，</w:t>
-      </w:r>
-      <w:r>
-        <w:t xml:space="preserve">RTX Acoustic </w:t>
-      </w:r>
-      <w:r>
-        <w:t>不輸出</w:t>
-      </w:r>
-      <w:r>
-        <w:t xml:space="preserve"> 3D point cloud</w:t>
-      </w:r>
-      <w:r>
-        <w:t>，而是輸出</w:t>
-      </w:r>
-      <w:r>
-        <w:t xml:space="preserve"> signal ways</w:t>
-      </w:r>
-      <w:r>
-        <w:t>。對</w:t>
-      </w:r>
-      <w:r>
-        <w:t xml:space="preserve"> acoustic sensor </w:t>
-      </w:r>
-      <w:r>
-        <w:t>而言，這些資料可理解為發射端、接收端、通道與振幅取樣值的組合（</w:t>
-      </w:r>
-      <w:r>
-        <w:t>NVIDIA, 2026a</w:t>
-      </w:r>
-      <w:r>
-        <w:t>）。本研究依此欄位語義整理出早期能量、峰值與接收端平衡等特徵；具體程式名稱與欄位對應放在附錄與</w:t>
-      </w:r>
-      <w:r>
-        <w:t xml:space="preserve"> GitHub </w:t>
-      </w:r>
-      <w:r>
-        <w:t>重現資料中。</w:t>
-      </w:r>
-    </w:p>
-    <w:p>
-      <w:pPr>
-        <w:pStyle w:val="Content"/>
-        <w:jc w:val="left"/>
-      </w:pPr>
-      <w:r>
-        <w:t>RTX Acoustic Sensor 在本研究使用版本中屬 experimental。官方文件說明其輸出為 signal-way amplitude samples，本文因此將其視為可控幾何下的合成超音波感測觀測來源。後續實驗與分析皆聚焦於 RTX Acoustic 特徵、機械手臂感測回授接近，以及離線狀態判斷，不再引入其他聲學模擬工具作為對照主線。</w:t>
+      <w:r>
+        <w:t>RTX Acoustic 不保證與實機 CH201 波形一致。本文所有結論均以任務級、趨勢級指標表述，不宣稱部署級測距精度。</w:t>
       </w:r>
     </w:p>
     <w:p>
@@ -5157,7 +4675,7 @@
         <w:pStyle w:val="Content"/>
       </w:pPr>
       <w:r>
-        <w:t>綜合前述各面向，現有文獻多覆蓋子集而非完整交集：Isaac Sim 平台研究鮮少同時處理 RTX Acoustic 可重複性與感測回授接近；聲學機器人研究多未提供完整的幾何、材質與任務設定紀錄；VLM 操作研究則少見以 RTX 超音波作 last-meter 非視覺感測回授。在 UR10e 工業手臂與腕部超音波感測場景下，同時整合上述要素之公開工作仍有限。</w:t>
+        <w:t>綜合前述各面向，現有文獻多覆蓋子集而非完整交集：Gao 等（2026）雖系統整理 Isaac Sim 平台，但未涵蓋 RTX Acoustic 與工業手臂感測回授接近；聲學機器人研究多未提供完整的幾何、材質與任務設定紀錄；VLM 操作研究則少見以 RTX 超音波作 last-meter 非視覺感測回授。在 UR10e 工業手臂與腕部超音波感測場景下，同時整合上述要素之公開工作仍有限。</w:t>
       </w:r>
     </w:p>
     <w:p>

</xml_diff>